<commit_message>
Updated scripts + template
</commit_message>
<xml_diff>
--- a/templates/gapfinder_readiness_template.docx
+++ b/templates/gapfinder_readiness_template.docx
@@ -9,6 +9,728 @@
           <w:bCs/>
         </w:rPr>
       </w:pPr>
+    </w:p>
+    <w:p>
+      <w:pPr>
+        <w:rPr>
+          <w:b/>
+          <w:bCs/>
+        </w:rPr>
+      </w:pPr>
+      <w:proofErr w:type="spellStart"/>
+      <w:r>
+        <w:rPr>
+          <w:b/>
+          <w:bCs/>
+        </w:rPr>
+        <w:t>GapFinder</w:t>
+      </w:r>
+      <w:proofErr w:type="spellEnd"/>
+      <w:r>
+        <w:rPr>
+          <w:b/>
+          <w:bCs/>
+        </w:rPr>
+        <w:t xml:space="preserve"> Score: {{</w:t>
+      </w:r>
+      <w:proofErr w:type="spellStart"/>
+      <w:r>
+        <w:rPr>
+          <w:b/>
+          <w:bCs/>
+        </w:rPr>
+        <w:t>GapFinderScore</w:t>
+      </w:r>
+      <w:proofErr w:type="spellEnd"/>
+      <w:r>
+        <w:rPr>
+          <w:b/>
+          <w:bCs/>
+        </w:rPr>
+        <w:t>}} / 10</w:t>
+      </w:r>
+    </w:p>
+    <w:p>
+      <w:pPr>
+        <w:rPr>
+          <w:b/>
+          <w:bCs/>
+        </w:rPr>
+      </w:pPr>
+    </w:p>
+    <w:p>
+      <w:pPr>
+        <w:rPr>
+          <w:b/>
+          <w:bCs/>
+        </w:rPr>
+      </w:pPr>
+      <w:r>
+        <w:rPr>
+          <w:b/>
+          <w:bCs/>
+        </w:rPr>
+        <w:t>Status: {{</w:t>
+      </w:r>
+      <w:proofErr w:type="spellStart"/>
+      <w:r>
+        <w:rPr>
+          <w:b/>
+          <w:bCs/>
+        </w:rPr>
+        <w:t>GapFinderStatus</w:t>
+      </w:r>
+      <w:proofErr w:type="spellEnd"/>
+      <w:r>
+        <w:rPr>
+          <w:b/>
+          <w:bCs/>
+        </w:rPr>
+        <w:t>}}</w:t>
+      </w:r>
+    </w:p>
+    <w:p>
+      <w:pPr>
+        <w:rPr>
+          <w:b/>
+          <w:bCs/>
+        </w:rPr>
+      </w:pPr>
+    </w:p>
+    <w:p>
+      <w:pPr>
+        <w:rPr>
+          <w:b/>
+          <w:bCs/>
+        </w:rPr>
+      </w:pPr>
+      <w:r>
+        <w:rPr>
+          <w:b/>
+          <w:bCs/>
+        </w:rPr>
+        <w:t>Top Issues:</w:t>
+      </w:r>
+    </w:p>
+    <w:p>
+      <w:pPr>
+        <w:rPr>
+          <w:b/>
+          <w:bCs/>
+        </w:rPr>
+      </w:pPr>
+      <w:r>
+        <w:rPr>
+          <w:b/>
+          <w:bCs/>
+        </w:rPr>
+        <w:t>{{</w:t>
+      </w:r>
+      <w:proofErr w:type="spellStart"/>
+      <w:r>
+        <w:rPr>
+          <w:b/>
+          <w:bCs/>
+        </w:rPr>
+        <w:t>TopIssues</w:t>
+      </w:r>
+      <w:proofErr w:type="spellEnd"/>
+      <w:r>
+        <w:rPr>
+          <w:b/>
+          <w:bCs/>
+        </w:rPr>
+        <w:t>}}</w:t>
+      </w:r>
+    </w:p>
+    <w:p>
+      <w:pPr>
+        <w:rPr>
+          <w:b/>
+          <w:bCs/>
+        </w:rPr>
+      </w:pPr>
+    </w:p>
+    <w:p>
+      <w:pPr>
+        <w:rPr>
+          <w:b/>
+          <w:bCs/>
+        </w:rPr>
+      </w:pPr>
+      <w:r>
+        <w:rPr>
+          <w:b/>
+          <w:bCs/>
+        </w:rPr>
+        <w:t>Score Breakdown:</w:t>
+      </w:r>
+    </w:p>
+    <w:p>
+      <w:pPr>
+        <w:rPr>
+          <w:b/>
+          <w:bCs/>
+        </w:rPr>
+      </w:pPr>
+      <w:r>
+        <w:rPr>
+          <w:b/>
+          <w:bCs/>
+        </w:rPr>
+        <w:t>Tracking Foundation: {{</w:t>
+      </w:r>
+      <w:proofErr w:type="spellStart"/>
+      <w:r>
+        <w:rPr>
+          <w:b/>
+          <w:bCs/>
+        </w:rPr>
+        <w:t>TrackingFoundationScore</w:t>
+      </w:r>
+      <w:proofErr w:type="spellEnd"/>
+      <w:r>
+        <w:rPr>
+          <w:b/>
+          <w:bCs/>
+        </w:rPr>
+        <w:t>}} / 2</w:t>
+      </w:r>
+    </w:p>
+    <w:p>
+      <w:pPr>
+        <w:rPr>
+          <w:b/>
+          <w:bCs/>
+        </w:rPr>
+      </w:pPr>
+      <w:r>
+        <w:rPr>
+          <w:b/>
+          <w:bCs/>
+        </w:rPr>
+        <w:t>Event Visibility: {{</w:t>
+      </w:r>
+      <w:proofErr w:type="spellStart"/>
+      <w:r>
+        <w:rPr>
+          <w:b/>
+          <w:bCs/>
+        </w:rPr>
+        <w:t>EventVisibilityScore</w:t>
+      </w:r>
+      <w:proofErr w:type="spellEnd"/>
+      <w:r>
+        <w:rPr>
+          <w:b/>
+          <w:bCs/>
+        </w:rPr>
+        <w:t>}} / 2</w:t>
+      </w:r>
+    </w:p>
+    <w:p>
+      <w:pPr>
+        <w:rPr>
+          <w:b/>
+          <w:bCs/>
+        </w:rPr>
+      </w:pPr>
+      <w:r>
+        <w:rPr>
+          <w:b/>
+          <w:bCs/>
+        </w:rPr>
+        <w:t>Payload Quality: {{</w:t>
+      </w:r>
+      <w:proofErr w:type="spellStart"/>
+      <w:r>
+        <w:rPr>
+          <w:b/>
+          <w:bCs/>
+        </w:rPr>
+        <w:t>PayloadQualityScore</w:t>
+      </w:r>
+      <w:proofErr w:type="spellEnd"/>
+      <w:r>
+        <w:rPr>
+          <w:b/>
+          <w:bCs/>
+        </w:rPr>
+        <w:t>}} / 2</w:t>
+      </w:r>
+    </w:p>
+    <w:p>
+      <w:pPr>
+        <w:rPr>
+          <w:b/>
+          <w:bCs/>
+        </w:rPr>
+      </w:pPr>
+      <w:r>
+        <w:rPr>
+          <w:b/>
+          <w:bCs/>
+        </w:rPr>
+        <w:t>Performance: {{</w:t>
+      </w:r>
+      <w:proofErr w:type="spellStart"/>
+      <w:r>
+        <w:rPr>
+          <w:b/>
+          <w:bCs/>
+        </w:rPr>
+        <w:t>PerformanceScore</w:t>
+      </w:r>
+      <w:proofErr w:type="spellEnd"/>
+      <w:r>
+        <w:rPr>
+          <w:b/>
+          <w:bCs/>
+        </w:rPr>
+        <w:t>}} / 2</w:t>
+      </w:r>
+    </w:p>
+    <w:p>
+      <w:pPr>
+        <w:rPr>
+          <w:b/>
+          <w:bCs/>
+        </w:rPr>
+      </w:pPr>
+      <w:r>
+        <w:rPr>
+          <w:b/>
+          <w:bCs/>
+        </w:rPr>
+        <w:t>Attribution Readiness: {{</w:t>
+      </w:r>
+      <w:proofErr w:type="spellStart"/>
+      <w:r>
+        <w:rPr>
+          <w:b/>
+          <w:bCs/>
+        </w:rPr>
+        <w:t>AttributionReadinessScore</w:t>
+      </w:r>
+      <w:proofErr w:type="spellEnd"/>
+      <w:r>
+        <w:rPr>
+          <w:b/>
+          <w:bCs/>
+        </w:rPr>
+        <w:t>}} / 2</w:t>
+      </w:r>
+    </w:p>
+    <w:p>
+      <w:pPr>
+        <w:rPr>
+          <w:b/>
+          <w:bCs/>
+        </w:rPr>
+      </w:pPr>
+    </w:p>
+    <w:p>
+      <w:pPr>
+        <w:rPr>
+          <w:b/>
+          <w:bCs/>
+        </w:rPr>
+      </w:pPr>
+      <w:r>
+        <w:rPr>
+          <w:b/>
+          <w:bCs/>
+        </w:rPr>
+        <w:t>Observed Event Reference</w:t>
+      </w:r>
+    </w:p>
+    <w:p>
+      <w:pPr>
+        <w:rPr>
+          <w:b/>
+          <w:bCs/>
+        </w:rPr>
+      </w:pPr>
+      <w:r>
+        <w:rPr>
+          <w:b/>
+          <w:bCs/>
+        </w:rPr>
+        <w:t>{{</w:t>
+      </w:r>
+      <w:proofErr w:type="spellStart"/>
+      <w:r>
+        <w:rPr>
+          <w:b/>
+          <w:bCs/>
+        </w:rPr>
+        <w:t>EventReference</w:t>
+      </w:r>
+      <w:proofErr w:type="spellEnd"/>
+      <w:r>
+        <w:rPr>
+          <w:b/>
+          <w:bCs/>
+        </w:rPr>
+        <w:t>}}</w:t>
+      </w:r>
+    </w:p>
+    <w:p>
+      <w:pPr>
+        <w:rPr>
+          <w:b/>
+          <w:bCs/>
+        </w:rPr>
+      </w:pPr>
+    </w:p>
+    <w:p>
+      <w:pPr>
+        <w:rPr>
+          <w:b/>
+          <w:bCs/>
+        </w:rPr>
+      </w:pPr>
+      <w:r>
+        <w:rPr>
+          <w:b/>
+          <w:bCs/>
+        </w:rPr>
+        <w:t>Payload Reference</w:t>
+      </w:r>
+    </w:p>
+    <w:p>
+      <w:pPr>
+        <w:rPr>
+          <w:b/>
+          <w:bCs/>
+        </w:rPr>
+      </w:pPr>
+      <w:r>
+        <w:rPr>
+          <w:b/>
+          <w:bCs/>
+        </w:rPr>
+        <w:t>{{</w:t>
+      </w:r>
+      <w:proofErr w:type="spellStart"/>
+      <w:r>
+        <w:rPr>
+          <w:b/>
+          <w:bCs/>
+        </w:rPr>
+        <w:t>PayloadReference</w:t>
+      </w:r>
+      <w:proofErr w:type="spellEnd"/>
+      <w:r>
+        <w:rPr>
+          <w:b/>
+          <w:bCs/>
+        </w:rPr>
+        <w:t>}}</w:t>
+      </w:r>
+    </w:p>
+    <w:p>
+      <w:pPr>
+        <w:rPr>
+          <w:b/>
+          <w:bCs/>
+        </w:rPr>
+      </w:pPr>
+    </w:p>
+    <w:p>
+      <w:pPr>
+        <w:rPr>
+          <w:b/>
+          <w:bCs/>
+        </w:rPr>
+      </w:pPr>
+      <w:r>
+        <w:rPr>
+          <w:b/>
+          <w:bCs/>
+        </w:rPr>
+        <w:t>Privacy &amp; Consent Visibility</w:t>
+      </w:r>
+    </w:p>
+    <w:p>
+      <w:pPr>
+        <w:rPr>
+          <w:b/>
+          <w:bCs/>
+        </w:rPr>
+      </w:pPr>
+    </w:p>
+    <w:p>
+      <w:pPr>
+        <w:rPr>
+          <w:b/>
+          <w:bCs/>
+        </w:rPr>
+      </w:pPr>
+      <w:r>
+        <w:rPr>
+          <w:b/>
+          <w:bCs/>
+        </w:rPr>
+        <w:t>Status: {{</w:t>
+      </w:r>
+      <w:proofErr w:type="spellStart"/>
+      <w:r>
+        <w:rPr>
+          <w:b/>
+          <w:bCs/>
+        </w:rPr>
+        <w:t>PrivacyConsentStatus</w:t>
+      </w:r>
+      <w:proofErr w:type="spellEnd"/>
+      <w:r>
+        <w:rPr>
+          <w:b/>
+          <w:bCs/>
+        </w:rPr>
+        <w:t>}} ({{</w:t>
+      </w:r>
+      <w:proofErr w:type="spellStart"/>
+      <w:r>
+        <w:rPr>
+          <w:b/>
+          <w:bCs/>
+        </w:rPr>
+        <w:t>PrivacyConsentScore</w:t>
+      </w:r>
+      <w:proofErr w:type="spellEnd"/>
+      <w:r>
+        <w:rPr>
+          <w:b/>
+          <w:bCs/>
+        </w:rPr>
+        <w:t>}})</w:t>
+      </w:r>
+    </w:p>
+    <w:p>
+      <w:pPr>
+        <w:rPr>
+          <w:b/>
+          <w:bCs/>
+        </w:rPr>
+      </w:pPr>
+    </w:p>
+    <w:p>
+      <w:pPr>
+        <w:rPr>
+          <w:b/>
+          <w:bCs/>
+        </w:rPr>
+      </w:pPr>
+      <w:r>
+        <w:rPr>
+          <w:b/>
+          <w:bCs/>
+        </w:rPr>
+        <w:t>{{</w:t>
+      </w:r>
+      <w:proofErr w:type="spellStart"/>
+      <w:r>
+        <w:rPr>
+          <w:b/>
+          <w:bCs/>
+        </w:rPr>
+        <w:t>PrivacyConsentSummary</w:t>
+      </w:r>
+      <w:proofErr w:type="spellEnd"/>
+      <w:r>
+        <w:rPr>
+          <w:b/>
+          <w:bCs/>
+        </w:rPr>
+        <w:t>}}</w:t>
+      </w:r>
+    </w:p>
+    <w:p>
+      <w:pPr>
+        <w:rPr>
+          <w:b/>
+          <w:bCs/>
+        </w:rPr>
+      </w:pPr>
+    </w:p>
+    <w:p>
+      <w:pPr>
+        <w:rPr>
+          <w:b/>
+          <w:bCs/>
+        </w:rPr>
+      </w:pPr>
+      <w:r>
+        <w:rPr>
+          <w:b/>
+          <w:bCs/>
+        </w:rPr>
+        <w:t>What we observed:</w:t>
+      </w:r>
+    </w:p>
+    <w:p>
+      <w:pPr>
+        <w:rPr>
+          <w:b/>
+          <w:bCs/>
+        </w:rPr>
+      </w:pPr>
+      <w:r>
+        <w:rPr>
+          <w:b/>
+          <w:bCs/>
+        </w:rPr>
+        <w:t>{{</w:t>
+      </w:r>
+      <w:proofErr w:type="spellStart"/>
+      <w:r>
+        <w:rPr>
+          <w:b/>
+          <w:bCs/>
+        </w:rPr>
+        <w:t>PrivacyConsentEvidence</w:t>
+      </w:r>
+      <w:proofErr w:type="spellEnd"/>
+      <w:r>
+        <w:rPr>
+          <w:b/>
+          <w:bCs/>
+        </w:rPr>
+        <w:t>}}</w:t>
+      </w:r>
+    </w:p>
+    <w:p>
+      <w:pPr>
+        <w:rPr>
+          <w:b/>
+          <w:bCs/>
+        </w:rPr>
+      </w:pPr>
+    </w:p>
+    <w:p>
+      <w:pPr>
+        <w:rPr>
+          <w:b/>
+          <w:bCs/>
+        </w:rPr>
+      </w:pPr>
+      <w:r>
+        <w:rPr>
+          <w:b/>
+          <w:bCs/>
+        </w:rPr>
+        <w:t>Important:</w:t>
+      </w:r>
+    </w:p>
+    <w:p>
+      <w:pPr>
+        <w:rPr>
+          <w:b/>
+          <w:bCs/>
+        </w:rPr>
+      </w:pPr>
+      <w:r>
+        <w:rPr>
+          <w:b/>
+          <w:bCs/>
+        </w:rPr>
+        <w:lastRenderedPageBreak/>
+        <w:t>This is a visibility check only. It does not confirm legal compliance.</w:t>
+      </w:r>
+    </w:p>
+    <w:p>
+      <w:pPr>
+        <w:rPr>
+          <w:b/>
+          <w:bCs/>
+        </w:rPr>
+      </w:pPr>
+      <w:r>
+        <w:rPr>
+          <w:b/>
+          <w:bCs/>
+        </w:rPr>
+        <w:t>Why this matters</w:t>
+      </w:r>
+    </w:p>
+    <w:p>
+      <w:pPr>
+        <w:rPr>
+          <w:b/>
+          <w:bCs/>
+        </w:rPr>
+      </w:pPr>
+    </w:p>
+    <w:p>
+      <w:pPr>
+        <w:rPr>
+          <w:b/>
+          <w:bCs/>
+        </w:rPr>
+      </w:pPr>
+      <w:r>
+        <w:rPr>
+          <w:b/>
+          <w:bCs/>
+        </w:rPr>
+        <w:t>Consent setup affects how reliably marketing and analytics platforms can collect, model, and use data.</w:t>
+      </w:r>
+    </w:p>
+    <w:p>
+      <w:pPr>
+        <w:rPr>
+          <w:b/>
+          <w:bCs/>
+        </w:rPr>
+      </w:pPr>
+    </w:p>
+    <w:p>
+      <w:pPr>
+        <w:rPr>
+          <w:b/>
+          <w:bCs/>
+        </w:rPr>
+      </w:pPr>
+      <w:r>
+        <w:rPr>
+          <w:b/>
+          <w:bCs/>
+        </w:rPr>
+        <w:t>This scan identifies visible privacy and consent signals only. It does not confirm legal compliance.</w:t>
+      </w:r>
+    </w:p>
+    <w:p>
+      <w:pPr>
+        <w:rPr>
+          <w:b/>
+          <w:bCs/>
+        </w:rPr>
+      </w:pPr>
+    </w:p>
+    <w:p>
+      <w:pPr>
+        <w:rPr>
+          <w:b/>
+          <w:bCs/>
+        </w:rPr>
+      </w:pPr>
+    </w:p>
+    <w:p>
+      <w:pPr>
+        <w:rPr>
+          <w:b/>
+          <w:bCs/>
+        </w:rPr>
+      </w:pPr>
+    </w:p>
+    <w:p>
+      <w:pPr>
+        <w:rPr>
+          <w:b/>
+          <w:bCs/>
+        </w:rPr>
+      </w:pPr>
       <w:r>
         <w:rPr>
           <w:b/>
@@ -338,6 +1060,7 @@
         </w:numPr>
       </w:pPr>
       <w:r>
+        <w:lastRenderedPageBreak/>
         <w:t>{{</w:t>
       </w:r>
       <w:proofErr w:type="spellStart"/>
@@ -439,7 +1162,6 @@
           <w:b/>
           <w:bCs/>
         </w:rPr>
-        <w:lastRenderedPageBreak/>
         <w:t>Journey Signals</w:t>
       </w:r>
     </w:p>
@@ -768,15 +1490,7 @@
           </w:tcPr>
           <w:p>
             <w:r>
-              <w:t>{{</w:t>
-            </w:r>
-            <w:proofErr w:type="spellStart"/>
-            <w:r>
-              <w:t>MobileCLS</w:t>
-            </w:r>
-            <w:proofErr w:type="spellEnd"/>
-            <w:r>
-              <w:t>}}</w:t>
+              <w:t>{{MobileCLS}}</w:t>
             </w:r>
           </w:p>
         </w:tc>
@@ -911,11 +1625,9 @@
               <w:t>MobileLCP</w:t>
             </w:r>
             <w:proofErr w:type="spellEnd"/>
-            <w:proofErr w:type="gramStart"/>
             <w:r>
               <w:t>}}s</w:t>
             </w:r>
-            <w:proofErr w:type="gramEnd"/>
           </w:p>
         </w:tc>
         <w:tc>
@@ -968,6 +1680,7 @@
                 <w:b/>
                 <w:bCs/>
               </w:rPr>
+              <w:lastRenderedPageBreak/>
               <w:t>Mobile FCP</w:t>
             </w:r>
             <w:r>
@@ -1042,11 +1755,9 @@
               <w:t>MobileFCP</w:t>
             </w:r>
             <w:proofErr w:type="spellEnd"/>
-            <w:proofErr w:type="gramStart"/>
             <w:r>
               <w:t>}}s</w:t>
             </w:r>
-            <w:proofErr w:type="gramEnd"/>
           </w:p>
         </w:tc>
         <w:tc>
@@ -1165,11 +1876,9 @@
               <w:t>MobileTTI</w:t>
             </w:r>
             <w:proofErr w:type="spellEnd"/>
-            <w:proofErr w:type="gramStart"/>
             <w:r>
               <w:t>}}s</w:t>
             </w:r>
-            <w:proofErr w:type="gramEnd"/>
           </w:p>
         </w:tc>
         <w:tc>
@@ -1222,7 +1931,6 @@
                 <w:b/>
                 <w:bCs/>
               </w:rPr>
-              <w:lastRenderedPageBreak/>
               <w:t>Mobile TBT</w:t>
             </w:r>
             <w:r>
@@ -1662,11 +2370,9 @@
               <w:t>DesktopLCP</w:t>
             </w:r>
             <w:proofErr w:type="spellEnd"/>
-            <w:proofErr w:type="gramStart"/>
             <w:r>
               <w:t>}}s</w:t>
             </w:r>
-            <w:proofErr w:type="gramEnd"/>
           </w:p>
         </w:tc>
         <w:tc>
@@ -1799,11 +2505,9 @@
               <w:t>DesktopFCP</w:t>
             </w:r>
             <w:proofErr w:type="spellEnd"/>
-            <w:proofErr w:type="gramStart"/>
             <w:r>
               <w:t>}}s</w:t>
             </w:r>
-            <w:proofErr w:type="gramEnd"/>
           </w:p>
         </w:tc>
         <w:tc>
@@ -2049,11 +2753,9 @@
               <w:t>DesktopTBT</w:t>
             </w:r>
             <w:proofErr w:type="spellEnd"/>
-            <w:proofErr w:type="gramStart"/>
             <w:r>
               <w:t>}}s</w:t>
             </w:r>
-            <w:proofErr w:type="gramEnd"/>
           </w:p>
         </w:tc>
         <w:tc>
@@ -2107,6 +2809,7 @@
                 <w:b/>
                 <w:bCs/>
               </w:rPr>
+              <w:lastRenderedPageBreak/>
               <w:t>Desktop Performance Overall</w:t>
             </w:r>
           </w:p>
@@ -2238,7 +2941,6 @@
           <w:b/>
           <w:bCs/>
         </w:rPr>
-        <w:lastRenderedPageBreak/>
         <w:t>Executive Snapshot</w:t>
       </w:r>
     </w:p>
@@ -2377,7 +3079,7 @@
     <w:p>
       <w:r>
         <w:pict w14:anchorId="185C8CFD">
-          <v:rect id="_x0000_i1073" style="width:0;height:1.5pt" o:hralign="center" o:hrstd="t" o:hr="t" fillcolor="#a0a0a0" stroked="f"/>
+          <v:rect id="_x0000_i1025" style="width:0;height:1.5pt" o:hralign="center" o:hrstd="t" o:hr="t" fillcolor="#a0a0a0" stroked="f"/>
         </w:pict>
       </w:r>
     </w:p>
@@ -2467,17 +3169,8 @@
           <w:b/>
           <w:bCs/>
         </w:rPr>
-        <w:t xml:space="preserve">Why </w:t>
-      </w:r>
-      <w:proofErr w:type="gramStart"/>
-      <w:r>
-        <w:rPr>
-          <w:b/>
-          <w:bCs/>
-        </w:rPr>
-        <w:t>this matters</w:t>
-      </w:r>
-      <w:proofErr w:type="gramEnd"/>
+        <w:t>Why this matters</w:t>
+      </w:r>
     </w:p>
     <w:p>
       <w:r>
@@ -2502,6 +3195,7 @@
         </w:numPr>
       </w:pPr>
       <w:r>
+        <w:lastRenderedPageBreak/>
         <w:t>Reports disagree</w:t>
       </w:r>
     </w:p>
@@ -2539,7 +3233,7 @@
     <w:p>
       <w:r>
         <w:pict w14:anchorId="31997E42">
-          <v:rect id="_x0000_i1074" style="width:0;height:1.5pt" o:hralign="center" o:hrstd="t" o:hr="t" fillcolor="#a0a0a0" stroked="f"/>
+          <v:rect id="_x0000_i1026" style="width:0;height:1.5pt" o:hralign="center" o:hrstd="t" o:hr="t" fillcolor="#a0a0a0" stroked="f"/>
         </w:pict>
       </w:r>
     </w:p>
@@ -2573,9 +3267,8 @@
     </w:p>
     <w:p>
       <w:r>
-        <w:lastRenderedPageBreak/>
         <w:pict w14:anchorId="688D743A">
-          <v:rect id="_x0000_i1075" style="width:0;height:1.5pt" o:hralign="center" o:hrstd="t" o:hr="t" fillcolor="#a0a0a0" stroked="f"/>
+          <v:rect id="_x0000_i1027" style="width:0;height:1.5pt" o:hralign="center" o:hrstd="t" o:hr="t" fillcolor="#a0a0a0" stroked="f"/>
         </w:pict>
       </w:r>
     </w:p>
@@ -2629,7 +3322,7 @@
     <w:p>
       <w:r>
         <w:pict w14:anchorId="15B0D580">
-          <v:rect id="_x0000_i1076" style="width:0;height:1.5pt" o:hralign="center" o:hrstd="t" o:hr="t" fillcolor="#a0a0a0" stroked="f"/>
+          <v:rect id="_x0000_i1028" style="width:0;height:1.5pt" o:hralign="center" o:hrstd="t" o:hr="t" fillcolor="#a0a0a0" stroked="f"/>
         </w:pict>
       </w:r>
     </w:p>
@@ -2698,17 +3391,8 @@
           <w:b/>
           <w:bCs/>
         </w:rPr>
-        <w:t xml:space="preserve">Why </w:t>
-      </w:r>
-      <w:proofErr w:type="gramStart"/>
-      <w:r>
-        <w:rPr>
-          <w:b/>
-          <w:bCs/>
-        </w:rPr>
-        <w:t>this matters</w:t>
-      </w:r>
-      <w:proofErr w:type="gramEnd"/>
+        <w:t>Why this matters</w:t>
+      </w:r>
     </w:p>
     <w:p>
       <w:r>
@@ -2766,7 +3450,7 @@
     <w:p>
       <w:r>
         <w:pict w14:anchorId="3BFB4FB7">
-          <v:rect id="_x0000_i1077" style="width:0;height:1.5pt" o:hralign="center" o:hrstd="t" o:hr="t" fillcolor="#a0a0a0" stroked="f"/>
+          <v:rect id="_x0000_i1029" style="width:0;height:1.5pt" o:hralign="center" o:hrstd="t" o:hr="t" fillcolor="#a0a0a0" stroked="f"/>
         </w:pict>
       </w:r>
     </w:p>
@@ -2817,6 +3501,7 @@
         </w:numPr>
       </w:pPr>
       <w:r>
+        <w:lastRenderedPageBreak/>
         <w:t>Currency captured: {{</w:t>
       </w:r>
       <w:proofErr w:type="spellStart"/>
@@ -2891,17 +3576,8 @@
           <w:b/>
           <w:bCs/>
         </w:rPr>
-        <w:t xml:space="preserve">Why </w:t>
-      </w:r>
-      <w:proofErr w:type="gramStart"/>
-      <w:r>
-        <w:rPr>
-          <w:b/>
-          <w:bCs/>
-        </w:rPr>
-        <w:t>this matters</w:t>
-      </w:r>
-      <w:proofErr w:type="gramEnd"/>
+        <w:t>Why this matters</w:t>
+      </w:r>
     </w:p>
     <w:p>
       <w:r>
@@ -2932,7 +3608,6 @@
         </w:numPr>
       </w:pPr>
       <w:r>
-        <w:lastRenderedPageBreak/>
         <w:t>ROAS becomes misleading</w:t>
       </w:r>
     </w:p>
@@ -2955,7 +3630,7 @@
     <w:p>
       <w:r>
         <w:pict w14:anchorId="332DEC82">
-          <v:rect id="_x0000_i1078" style="width:0;height:1.5pt" o:hralign="center" o:hrstd="t" o:hr="t" fillcolor="#a0a0a0" stroked="f"/>
+          <v:rect id="_x0000_i1030" style="width:0;height:1.5pt" o:hralign="center" o:hrstd="t" o:hr="t" fillcolor="#a0a0a0" stroked="f"/>
         </w:pict>
       </w:r>
     </w:p>
@@ -3036,17 +3711,8 @@
           <w:b/>
           <w:bCs/>
         </w:rPr>
-        <w:t xml:space="preserve">Why </w:t>
-      </w:r>
-      <w:proofErr w:type="gramStart"/>
-      <w:r>
-        <w:rPr>
-          <w:b/>
-          <w:bCs/>
-        </w:rPr>
-        <w:t>this matters</w:t>
-      </w:r>
-      <w:proofErr w:type="gramEnd"/>
+        <w:t>Why this matters</w:t>
+      </w:r>
     </w:p>
     <w:p>
       <w:r>
@@ -3103,7 +3769,7 @@
     <w:p>
       <w:r>
         <w:pict w14:anchorId="03D70694">
-          <v:rect id="_x0000_i1079" style="width:0;height:1.5pt" o:hralign="center" o:hrstd="t" o:hr="t" fillcolor="#a0a0a0" stroked="f"/>
+          <v:rect id="_x0000_i1031" style="width:0;height:1.5pt" o:hralign="center" o:hrstd="t" o:hr="t" fillcolor="#a0a0a0" stroked="f"/>
         </w:pict>
       </w:r>
     </w:p>
@@ -3172,17 +3838,8 @@
           <w:b/>
           <w:bCs/>
         </w:rPr>
-        <w:t xml:space="preserve">Why </w:t>
-      </w:r>
-      <w:proofErr w:type="gramStart"/>
-      <w:r>
-        <w:rPr>
-          <w:b/>
-          <w:bCs/>
-        </w:rPr>
-        <w:t>this matters</w:t>
-      </w:r>
-      <w:proofErr w:type="gramEnd"/>
+        <w:t>Why this matters</w:t>
+      </w:r>
     </w:p>
     <w:p>
       <w:r>
@@ -3197,6 +3854,7 @@
         </w:numPr>
       </w:pPr>
       <w:r>
+        <w:lastRenderedPageBreak/>
         <w:t>Site speed</w:t>
       </w:r>
     </w:p>
@@ -3235,7 +3893,7 @@
     <w:p>
       <w:r>
         <w:pict w14:anchorId="6B241CF3">
-          <v:rect id="_x0000_i1080" style="width:0;height:1.5pt" o:hralign="center" o:hrstd="t" o:hr="t" fillcolor="#a0a0a0" stroked="f"/>
+          <v:rect id="_x0000_i1032" style="width:0;height:1.5pt" o:hralign="center" o:hrstd="t" o:hr="t" fillcolor="#a0a0a0" stroked="f"/>
         </w:pict>
       </w:r>
     </w:p>
@@ -3271,7 +3929,6 @@
           <w:b/>
           <w:bCs/>
         </w:rPr>
-        <w:lastRenderedPageBreak/>
         <w:t>Mobile</w:t>
       </w:r>
     </w:p>
@@ -3321,15 +3978,7 @@
         </w:numPr>
       </w:pPr>
       <w:r>
-        <w:t>CLS (layout stability): {{</w:t>
-      </w:r>
-      <w:proofErr w:type="spellStart"/>
-      <w:r>
-        <w:t>MobileCLS</w:t>
-      </w:r>
-      <w:proofErr w:type="spellEnd"/>
-      <w:r>
-        <w:t>}}</w:t>
+        <w:t>CLS (layout stability): {{MobileCLS}}</w:t>
       </w:r>
     </w:p>
     <w:p>
@@ -3416,17 +4065,8 @@
           <w:b/>
           <w:bCs/>
         </w:rPr>
-        <w:t xml:space="preserve">Why </w:t>
-      </w:r>
-      <w:proofErr w:type="gramStart"/>
-      <w:r>
-        <w:rPr>
-          <w:b/>
-          <w:bCs/>
-        </w:rPr>
-        <w:t>this matters</w:t>
-      </w:r>
-      <w:proofErr w:type="gramEnd"/>
+        <w:t>Why this matters</w:t>
+      </w:r>
     </w:p>
     <w:p>
       <w:r>
@@ -7282,6 +7922,7 @@
   <w:style w:type="character" w:default="1" w:styleId="DefaultParagraphFont">
     <w:name w:val="Default Paragraph Font"/>
     <w:uiPriority w:val="1"/>
+    <w:semiHidden/>
     <w:unhideWhenUsed/>
   </w:style>
   <w:style w:type="table" w:default="1" w:styleId="TableNormal">

</xml_diff>